<commit_message>
Agregando minuta del 18-09
</commit_message>
<xml_diff>
--- a/Bibliografia/Material_De_Estudio/Minutas/11-09_Definicion_De_MVP_Fernandez.docx
+++ b/Bibliografia/Material_De_Estudio/Minutas/11-09_Definicion_De_MVP_Fernandez.docx
@@ -495,7 +495,12 @@
     </w:p>
     <w:p>
       <w:r>
-        <w:t>- Se debe seleccionar el tipo de actividad.</w:t>
+        <w:t xml:space="preserve">- Se debe </w:t>
+      </w:r>
+      <w:bookmarkStart w:id="0" w:name="_GoBack"/>
+      <w:bookmarkEnd w:id="0"/>
+      <w:r>
+        <w:t>seleccionar el tipo de actividad.</w:t>
       </w:r>
     </w:p>
     <w:p>
@@ -744,10 +749,7 @@
       </w:r>
       <w:proofErr w:type="gramEnd"/>
       <w:r>
-        <w:t xml:space="preserve">     “           “  </w:t>
-      </w:r>
-      <w:r>
-        <w:t xml:space="preserve">      </w:t>
+        <w:t xml:space="preserve">     “           “        </w:t>
       </w:r>
       <w:r>
         <w:t>la ubicación del visitantes en</w:t>
@@ -839,10 +841,7 @@
         </w:numPr>
       </w:pPr>
       <w:r>
-        <w:t xml:space="preserve">Probar ver mapa interactivo y pulsar sobre el ícono del micrófono para ver los shows del día, </w:t>
-      </w:r>
-      <w:r>
-        <w:t>y no los hay</w:t>
+        <w:t>Probar ver mapa interactivo y pulsar sobre el ícono del micrófono para ver los shows del día, y no los hay</w:t>
       </w:r>
       <w:r>
         <w:t xml:space="preserve"> (falla</w:t>
@@ -1026,7 +1025,13 @@
         </w:numPr>
       </w:pPr>
       <w:r>
-        <w:t>Registrar propuesta de venta.</w:t>
+        <w:t>Registrar</w:t>
+      </w:r>
+      <w:r>
+        <w:t>/confirmar</w:t>
+      </w:r>
+      <w:r>
+        <w:t xml:space="preserve"> propuesta de venta.</w:t>
       </w:r>
     </w:p>
     <w:p>
@@ -1076,8 +1081,6 @@
         <w:lastRenderedPageBreak/>
         <w:t>Pago a los vendedores</w:t>
       </w:r>
-      <w:bookmarkStart w:id="0" w:name="_GoBack"/>
-      <w:bookmarkEnd w:id="0"/>
     </w:p>
     <w:p>
       <w:pPr>

</xml_diff>